<commit_message>
learned a little about rstudio
</commit_message>
<xml_diff>
--- a/archy-459-week-1.Rproj.docx
+++ b/archy-459-week-1.Rproj.docx
@@ -72,7 +72,7 @@
         <w:t xml:space="preserve"> </w:t>
       </w:r>
       <w:r>
-        <w:t xml:space="preserve">button a document will be generated that includes both content and the output of embedded code. You can embed code like this:</w:t>
+        <w:t xml:space="preserve">button a document will be generated that includes both content and the output of embedded code.</w:t>
       </w:r>
     </w:p>
     <w:p>
@@ -131,18 +131,7 @@
     </w:p>
     <w:p>
       <w:pPr>
-        <w:pStyle w:val="SourceCode"/>
-      </w:pPr>
-      <w:r>
-        <w:rPr>
-          <w:rStyle w:val="VerbatimChar"/>
-        </w:rPr>
-        <w:t xml:space="preserve">[1] 4</w:t>
-      </w:r>
-    </w:p>
-    <w:p>
-      <w:pPr>
-        <w:pStyle w:val="FirstParagraph"/>
+        <w:pStyle w:val="BodyText"/>
       </w:pPr>
       <w:r>
         <w:t xml:space="preserve">The</w:t>
@@ -161,6 +150,14 @@
       </w:r>
       <w:r>
         <w:t xml:space="preserve">option disables the printing of code (only output is displayed).</w:t>
+      </w:r>
+    </w:p>
+    <w:p>
+      <w:pPr>
+        <w:pStyle w:val="BodyText"/>
+      </w:pPr>
+      <w:r>
+        <w:t xml:space="preserve">My favorite thing is inline R code like this 4</w:t>
       </w:r>
     </w:p>
     <w:bookmarkEnd w:id="11"/>

</xml_diff>